<commit_message>
Dismissal procedure card: bus order K-2, 3-5, 6-8; Chromebooks to numbered cart spots
</commit_message>
<xml_diff>
--- a/resources/systems/procedures/schoolwide/02-dismissal.docx
+++ b/resources/systems/procedures/schoolwide/02-dismissal.docx
@@ -961,7 +961,7 @@
                 <w:szCs w:val="19"/>
                 <w:rtl w:val="0"/>
               </w:rPr>
-              <w:t xml:space="preserve">Confirms pencils/computers stay on the desk.</w:t>
+              <w:t xml:space="preserve">Confirms pencils stay on the desk and Chromebooks go into their numbered cart spots as students leave.</w:t>
             </w:r>
             <w:r>
               <w:rPr>
@@ -994,7 +994,7 @@
                 <w:szCs w:val="19"/>
                 <w:rtl w:val="0"/>
               </w:rPr>
-              <w:t xml:space="preserve">Walkers stand, gather belongings, leave computer and pencil on the desk, walk out. No lining up at the door, any grade.</w:t>
+              <w:t xml:space="preserve">Walkers stand, gather belongings, plug their Chromebook into their numbered spot in the charging cart (the same number as their workbook), leave their pencil on the desk, and walk out. No lining up at the door, any grade.</w:t>
             </w:r>
             <w:r>
               <w:rPr>
@@ -1171,7 +1171,7 @@
                 <w:szCs w:val="19"/>
                 <w:rtl w:val="0"/>
               </w:rPr>
-              <w:t xml:space="preserve">Escorts students to buses (6–8, then 3–5, then K–2, in that order).</w:t>
+              <w:t xml:space="preserve">Escorts students to buses (K–2 at 2:17, then 3–5 at 2:20, then 6–8 at 2:23, in that order).</w:t>
             </w:r>
             <w:r>
               <w:rPr>
@@ -1276,7 +1276,7 @@
                 <w:szCs w:val="19"/>
                 <w:rtl w:val="0"/>
               </w:rPr>
-              <w:t xml:space="preserve">Assigns jobs to the remaining bus-rider group only (not the whole class): computers, papers, pencils, markers, desk-checker, floor/trash.</w:t>
+              <w:t xml:space="preserve">Assigns jobs to the remaining bus-rider group only (not the whole class): cart check (every Chromebook plugged in at its number), papers, pencils, markers, desk-checker, floor/trash.</w:t>
             </w:r>
             <w:r>
               <w:rPr>
@@ -1479,7 +1479,7 @@
           <w:vertAlign w:val="baseline"/>
           <w:rtl w:val="0"/>
         </w:rPr>
-        <w:t xml:space="preserve">Dry-erase boards stored vertically in the rolling-desk slot; pencils and computers stay on the desk until called.</w:t>
+        <w:t xml:space="preserve">Dry-erase boards stored vertically in the rolling-desk slot; pencils stay on the desk; each Chromebook goes into its numbered cart spot as its student leaves.</w:t>
       </w:r>
       <w:r>
         <w:rPr>
@@ -1616,7 +1616,7 @@
           <w:szCs w:val="21"/>
           <w:rtl w:val="0"/>
         </w:rPr>
-        <w:t xml:space="preserve">“Walkers, grab your things and head out — leave your computer and pencil right where they are.”</w:t>
+        <w:t xml:space="preserve">“Walkers, grab your things, plug your Chromebook into your number in the cart, and head out. Your pencil stays on the desk.”</w:t>
       </w:r>
       <w:r>
         <w:rPr>
@@ -1874,7 +1874,7 @@
           <w:szCs w:val="21"/>
           <w:rtl w:val="0"/>
         </w:rPr>
-        <w:t xml:space="preserve">“When you hear the announcement, that's your signal to start putting things away — but you stay in your seat. A few minutes later, I'll call walkers — if that's you, grab your things and head out, but leave your computer and pencil right where they are. Then car riders and aftercare go to the cafeteria, and after-school-activity kids go to the gym. Last, I'll walk bus riders out group by group — 6th through 8th first, then 3rd through 5th, then K through 2.”</w:t>
+        <w:t xml:space="preserve">“When you hear the announcement, that's your signal to start putting things away — but you stay in your seat. A few minutes later, I'll call walkers — if that's you, grab your things, plug your Chromebook into your number in the cart, and head out. Your pencil stays on the desk. Then car riders and aftercare go to the cafeteria, and after-school-activity kids go to the gym. Last, I'll walk bus riders out group by group: K through 2 first, then 3rd through 5th, then 6th through 8th. Every group plugs in Chromebooks on the way out.”</w:t>
       </w:r>
       <w:r>
         <w:rPr>

</xml_diff>